<commit_message>
docs: document dynamic assembly + leak-match detector
Adds Section 10 "Defense in Depth — Dynamic Assembly & Leak-Match Detector"
and threads the two features through the rest of the document:
- data model: questions, candidate_papers tables + exam assembly_mode/blueprint
- API table: /questions, /exams/{id}/blueprint, /investigator/match
- audit actions: QUESTION_ADDED, PAPER_ASSEMBLED, LEAK_MATCHED
- frontend: Static/Dynamic toggle + leak-match panel
- testing: now 81 tests (added dynamic-assembly + leak-match rows)
- milestones, project layout, and glossary updated
Regenerated .docx and .pdf.

Co-Authored-By: Claude Opus 4.8 (1M context) <noreply@anthropic.com>
</commit_message>
<xml_diff>
--- a/Trace_Project_Documentation.docx
+++ b/Trace_Project_Documentation.docx
@@ -203,7 +203,7 @@
         <w:rPr>
           <w:sz w:val="22"/>
         </w:rPr>
-        <w:t>10. The Backend — Modules &amp; Data Model</w:t>
+        <w:t>10. Defense in Depth — Dynamic Assembly &amp; Leak-Match Detector</w:t>
       </w:r>
     </w:p>
     <w:p>
@@ -214,7 +214,7 @@
         <w:rPr>
           <w:sz w:val="22"/>
         </w:rPr>
-        <w:t>11. The API — Every Endpoint</w:t>
+        <w:t>11. The Backend — Modules &amp; Data Model</w:t>
       </w:r>
     </w:p>
     <w:p>
@@ -225,7 +225,7 @@
         <w:rPr>
           <w:sz w:val="22"/>
         </w:rPr>
-        <w:t>12. The Frontend — Four Role Dashboards</w:t>
+        <w:t>12. The API — Every Endpoint</w:t>
       </w:r>
     </w:p>
     <w:p>
@@ -236,7 +236,7 @@
         <w:rPr>
           <w:sz w:val="22"/>
         </w:rPr>
-        <w:t>13. Security Model &amp; Trust Boundary</w:t>
+        <w:t>13. The Frontend — Four Role Dashboards</w:t>
       </w:r>
     </w:p>
     <w:p>
@@ -247,7 +247,7 @@
         <w:rPr>
           <w:sz w:val="22"/>
         </w:rPr>
-        <w:t>14. Testing &amp; Verification</w:t>
+        <w:t>14. Security Model &amp; Trust Boundary</w:t>
       </w:r>
     </w:p>
     <w:p>
@@ -258,7 +258,7 @@
         <w:rPr>
           <w:sz w:val="22"/>
         </w:rPr>
-        <w:t>15. How to Run It Yourself</w:t>
+        <w:t>15. Testing &amp; Verification</w:t>
       </w:r>
     </w:p>
     <w:p>
@@ -269,7 +269,7 @@
         <w:rPr>
           <w:sz w:val="22"/>
         </w:rPr>
-        <w:t>16. Build Status (Milestones)</w:t>
+        <w:t>16. How to Run It Yourself</w:t>
       </w:r>
     </w:p>
     <w:p>
@@ -280,7 +280,7 @@
         <w:rPr>
           <w:sz w:val="22"/>
         </w:rPr>
-        <w:t>17. Project Layout</w:t>
+        <w:t>17. Build Status (Milestones)</w:t>
       </w:r>
     </w:p>
     <w:p>
@@ -291,7 +291,18 @@
         <w:rPr>
           <w:sz w:val="22"/>
         </w:rPr>
-        <w:t>18. Glossary</w:t>
+        <w:t>18. Project Layout</w:t>
+      </w:r>
+    </w:p>
+    <w:p>
+      <w:pPr>
+        <w:spacing w:after="60"/>
+      </w:pPr>
+      <w:r>
+        <w:rPr>
+          <w:sz w:val="22"/>
+        </w:rPr>
+        <w:t>19. Glossary</w:t>
       </w:r>
     </w:p>
     <w:p>
@@ -1670,7 +1681,7 @@
         <w:pStyle w:val="ListBullet"/>
       </w:pPr>
       <w:r>
-        <w:t>Recorded actions include: LOGIN, EXAM_SEALED, SHARE_SUBMITTED, UNLOCK_DENIED, PAPER_UNLOCKED, PAPER_ACCESSED, WATERMARK_ISSUED, LEAK_TRACED, AUDIT_VERIFIED.</w:t>
+        <w:t>Recorded actions include: LOGIN, EXAM_SEALED, SHARE_SUBMITTED, UNLOCK_DENIED, PAPER_UNLOCKED, PAPER_ACCESSED, WATERMARK_ISSUED, LEAK_TRACED, AUDIT_VERIFIED, QUESTION_ADDED, PAPER_ASSEMBLED, and LEAK_MATCHED.</w:t>
       </w:r>
     </w:p>
     <w:p>
@@ -1697,7 +1708,177 @@
         <w:rPr>
           <w:color w:val="0E7A8C"/>
         </w:rPr>
-        <w:t>10.  The Backend — Modules &amp; Data Model</w:t>
+        <w:t>10.  Defense in Depth — Dynamic Assembly &amp; Leak-Match Detector</w:t>
+      </w:r>
+    </w:p>
+    <w:p>
+      <w:r>
+        <w:rPr>
+          <w:sz w:val="22"/>
+        </w:rPr>
+        <w:t>Beyond the three core guarantees, Trace adds two further layers that directly shrink the chance and the blast radius of a leak — and trace one even when no image exists.</w:t>
+      </w:r>
+    </w:p>
+    <w:p>
+      <w:pPr>
+        <w:pStyle w:val="Heading2"/>
+      </w:pPr>
+      <w:r>
+        <w:rPr>
+          <w:color w:val="141B2E"/>
+        </w:rPr>
+        <w:t>10.1  Dynamic per-candidate paper assembly</w:t>
+      </w:r>
+    </w:p>
+    <w:p>
+      <w:r>
+        <w:rPr>
+          <w:sz w:val="22"/>
+        </w:rPr>
+        <w:t>A static exam is one secret blob: leak it once and the whole exam is compromised, for everyone. Dynamic assembly removes that single point of failure. Instead of one paper, the system keeps a large bank of individually-encrypted questions; at release time a blueprint (sections + counts) and a per-candidate seed select a unique subset and assemble that candidate's paper on demand.</w:t>
+      </w:r>
+    </w:p>
+    <w:p>
+      <w:pPr>
+        <w:pStyle w:val="ListBullet"/>
+      </w:pPr>
+      <w:r>
+        <w:rPr>
+          <w:b/>
+          <w:color w:val="0E7A8C"/>
+        </w:rPr>
+        <w:t>Encrypted bank —</w:t>
+      </w:r>
+      <w:r>
+        <w:t xml:space="preserve">  Each question body is AES-256-GCM ciphertext at rest, under a server question-bank key that is domain-separated from the vault key — a database dump cannot read the bank.</w:t>
+      </w:r>
+    </w:p>
+    <w:p>
+      <w:pPr>
+        <w:pStyle w:val="ListBullet"/>
+      </w:pPr>
+      <w:r>
+        <w:rPr>
+          <w:b/>
+          <w:color w:val="0E7A8C"/>
+        </w:rPr>
+        <w:t>Unpredictable —</w:t>
+      </w:r>
+      <w:r>
+        <w:t xml:space="preserve">  The selection seed is HMAC(exam_key, "exam:candidate:section"). Because the exam key only exists after the Shamir quorum AND the time gate open, no setter, admin, or database reader can predict which questions reach which candidate before release.</w:t>
+      </w:r>
+    </w:p>
+    <w:p>
+      <w:pPr>
+        <w:pStyle w:val="ListBullet"/>
+      </w:pPr>
+      <w:r>
+        <w:rPr>
+          <w:b/>
+          <w:color w:val="0E7A8C"/>
+        </w:rPr>
+        <w:t>Low blast radius —</w:t>
+      </w:r>
+      <w:r>
+        <w:t xml:space="preserve">  Every candidate's paper is content-distinct, so a leaked copy exposes only one variant — and, combined with the DCT watermark, still names its owner.</w:t>
+      </w:r>
+    </w:p>
+    <w:p>
+      <w:pPr>
+        <w:pStyle w:val="ListBullet"/>
+      </w:pPr>
+      <w:r>
+        <w:rPr>
+          <w:b/>
+          <w:color w:val="0E7A8C"/>
+        </w:rPr>
+        <w:t>Immutable once sealed —</w:t>
+      </w:r>
+      <w:r>
+        <w:t xml:space="preserve">  At seal time the per-section pools are frozen inside the encrypted manifest, so retiring or editing a bank question later cannot change (or break) an already-sealed exam's papers.</w:t>
+      </w:r>
+    </w:p>
+    <w:p>
+      <w:pPr>
+        <w:pStyle w:val="ListBullet"/>
+      </w:pPr>
+      <w:r>
+        <w:rPr>
+          <w:b/>
+          <w:color w:val="0E7A8C"/>
+        </w:rPr>
+        <w:t>Never stored —</w:t>
+      </w:r>
+      <w:r>
+        <w:t xml:space="preserve">  Only the selection (a list of question ids) is recorded per candidate — the assembled paper is never persisted in plaintext; it exists only in memory while one request is served.</w:t>
+      </w:r>
+    </w:p>
+    <w:p>
+      <w:pPr>
+        <w:pStyle w:val="Heading2"/>
+      </w:pPr>
+      <w:r>
+        <w:rPr>
+          <w:color w:val="141B2E"/>
+        </w:rPr>
+        <w:t>10.2  Leak-match detector (text-only leaks)</w:t>
+      </w:r>
+    </w:p>
+    <w:p>
+      <w:r>
+        <w:rPr>
+          <w:sz w:val="22"/>
+        </w:rPr>
+        <w:t>Real leaks are often just text — a question pasted into a chat group, with no image to trace. The leak-match detector handles exactly this case. An investigator pastes the suspected text and Trace:</w:t>
+      </w:r>
+    </w:p>
+    <w:p>
+      <w:pPr>
+        <w:pStyle w:val="ListBullet"/>
+      </w:pPr>
+      <w:r>
+        <w:rPr>
+          <w:b/>
+          <w:color w:val="0E7A8C"/>
+        </w:rPr>
+        <w:t>Identifies what leaked —</w:t>
+      </w:r>
+      <w:r>
+        <w:t xml:space="preserve">  matches it against the encrypted bank by token-containment on each question's prompt (option labels are excluded so short prompts are not over-matched), flagging every question the text contains;</w:t>
+      </w:r>
+    </w:p>
+    <w:p>
+      <w:pPr>
+        <w:pStyle w:val="ListBullet"/>
+      </w:pPr>
+      <w:r>
+        <w:rPr>
+          <w:b/>
+          <w:color w:val="0E7A8C"/>
+        </w:rPr>
+        <w:t>Narrows who leaked it —</w:t>
+      </w:r>
+      <w:r>
+        <w:t xml:space="preserve">  intersects the per-candidate selection records: a candidate whose paper contained every matched question is a prime suspect; otherwise the highest-overlap candidate is the strongest lead. The issued-watermark fingerprint is attached for an image follow-up.</w:t>
+      </w:r>
+    </w:p>
+    <w:p>
+      <w:r>
+        <w:rPr>
+          <w:sz w:val="22"/>
+        </w:rPr>
+        <w:t>This is where dynamic assembly pays off forensically: because every candidate received a different combination, a leak containing several questions intersects to a very small suspect set — often a single candidate.</w:t>
+      </w:r>
+    </w:p>
+    <w:p>
+      <w:pPr>
+        <w:pStyle w:val="Heading1"/>
+      </w:pPr>
+      <w:r>
+        <w:rPr>
+          <w:color w:val="0E7A8C"/>
+        </w:rPr>
+        <w:t>11.  The Backend — Modules &amp; Data Model</w:t>
       </w:r>
     </w:p>
     <w:p>
@@ -1913,7 +2094,7 @@
                 <w:b w:val="0"/>
                 <w:sz w:val="20"/>
               </w:rPr>
-              <w:t>exams.py — the seal, unlock-ceremony, and serve logic</w:t>
+              <w:t>exams.py (seal/unlock/serve), assembly.py (dynamic question bank), leakmatch.py (text leak detector), watermarking.py</w:t>
             </w:r>
           </w:p>
         </w:tc>
@@ -1945,7 +2126,7 @@
                 <w:b w:val="0"/>
                 <w:sz w:val="20"/>
               </w:rPr>
-              <w:t>app.py (FastAPI factory) + routers/ (auth, exams, investigator, audit)</w:t>
+              <w:t>app.py (FastAPI factory) + routers/ (auth, exams, questions, investigator, audit)</w:t>
             </w:r>
           </w:p>
         </w:tc>
@@ -2009,7 +2190,7 @@
                 <w:b w:val="0"/>
                 <w:sz w:val="20"/>
               </w:rPr>
-              <w:t>demo-account seeding; env-driven settings</w:t>
+              <w:t>demo seeding + idempotent migration; env-driven settings</w:t>
             </w:r>
           </w:p>
         </w:tc>
@@ -2165,7 +2346,7 @@
                 <w:b w:val="0"/>
                 <w:sz w:val="20"/>
               </w:rPr>
-              <w:t>name, release_time, threshold_k, num_custodians_n, nonce, tag, ciphertext, aad, status, released_key_wrapped</w:t>
+              <w:t>name, release_time, threshold_k, nonce, tag, ciphertext, aad, status, released_key_wrapped, assembly_mode, blueprint</w:t>
             </w:r>
           </w:p>
         </w:tc>
@@ -2180,7 +2361,7 @@
                 <w:b w:val="0"/>
                 <w:sz w:val="20"/>
               </w:rPr>
-              <w:t>A sealed paper and its unlock state</w:t>
+              <w:t>A sealed paper/manifest and its unlock state</w:t>
             </w:r>
           </w:p>
         </w:tc>
@@ -2291,6 +2472,100 @@
                 <w:b w:val="0"/>
                 <w:sz w:val="20"/>
               </w:rPr>
+              <w:t>questions</w:t>
+            </w:r>
+          </w:p>
+        </w:tc>
+        <w:tc>
+          <w:tcPr>
+            <w:tcW w:type="dxa" w:w="4320"/>
+          </w:tcPr>
+          <w:p>
+            <w:r/>
+            <w:r>
+              <w:rPr>
+                <w:b w:val="0"/>
+                <w:sz w:val="20"/>
+              </w:rPr>
+              <w:t>subject, section, topic, difficulty, nonce, tag, ciphertext, contributor</w:t>
+            </w:r>
+          </w:p>
+        </w:tc>
+        <w:tc>
+          <w:tcPr>
+            <w:tcW w:type="dxa" w:w="3024"/>
+          </w:tcPr>
+          <w:p>
+            <w:r/>
+            <w:r>
+              <w:rPr>
+                <w:b w:val="0"/>
+                <w:sz w:val="20"/>
+              </w:rPr>
+              <w:t>The encrypted question bank (bodies are ciphertext)</w:t>
+            </w:r>
+          </w:p>
+        </w:tc>
+      </w:tr>
+      <w:tr>
+        <w:tc>
+          <w:tcPr>
+            <w:tcW w:type="dxa" w:w="2016"/>
+          </w:tcPr>
+          <w:p>
+            <w:r/>
+            <w:r>
+              <w:rPr>
+                <w:b w:val="0"/>
+                <w:sz w:val="20"/>
+              </w:rPr>
+              <w:t>candidate_papers</w:t>
+            </w:r>
+          </w:p>
+        </w:tc>
+        <w:tc>
+          <w:tcPr>
+            <w:tcW w:type="dxa" w:w="4320"/>
+          </w:tcPr>
+          <w:p>
+            <w:r/>
+            <w:r>
+              <w:rPr>
+                <w:b w:val="0"/>
+                <w:sz w:val="20"/>
+              </w:rPr>
+              <w:t>exam_id, username, selected_question_ids, assembled_at</w:t>
+            </w:r>
+          </w:p>
+        </w:tc>
+        <w:tc>
+          <w:tcPr>
+            <w:tcW w:type="dxa" w:w="3024"/>
+          </w:tcPr>
+          <w:p>
+            <w:r/>
+            <w:r>
+              <w:rPr>
+                <w:b w:val="0"/>
+                <w:sz w:val="20"/>
+              </w:rPr>
+              <w:t>Per-candidate selection (ids only, never plaintext)</w:t>
+            </w:r>
+          </w:p>
+        </w:tc>
+      </w:tr>
+      <w:tr>
+        <w:tc>
+          <w:tcPr>
+            <w:tcW w:type="dxa" w:w="2016"/>
+          </w:tcPr>
+          <w:p>
+            <w:r/>
+            <w:r>
+              <w:rPr>
+                <w:b w:val="0"/>
+                <w:sz w:val="20"/>
+              </w:rPr>
               <w:t>issued_watermarks</w:t>
             </w:r>
           </w:p>
@@ -2382,7 +2657,7 @@
         <w:rPr>
           <w:color w:val="0E7A8C"/>
         </w:rPr>
-        <w:t>11.  The API — Every Endpoint</w:t>
+        <w:t>12.  The API — Every Endpoint</w:t>
       </w:r>
     </w:p>
     <w:tbl>
@@ -2418,7 +2693,7 @@
         </w:tc>
         <w:tc>
           <w:tcPr>
-            <w:tcW w:type="dxa" w:w="3312"/>
+            <w:tcW w:type="dxa" w:w="3456"/>
             <w:shd w:val="clear" w:color="auto" w:fill="0E7A8C"/>
           </w:tcPr>
           <w:p>
@@ -2435,7 +2710,7 @@
         </w:tc>
         <w:tc>
           <w:tcPr>
-            <w:tcW w:type="dxa" w:w="2304"/>
+            <w:tcW w:type="dxa" w:w="2160"/>
             <w:shd w:val="clear" w:color="auto" w:fill="0E7A8C"/>
           </w:tcPr>
           <w:p>
@@ -2486,7 +2761,7 @@
         </w:tc>
         <w:tc>
           <w:tcPr>
-            <w:tcW w:type="dxa" w:w="3312"/>
+            <w:tcW w:type="dxa" w:w="3456"/>
           </w:tcPr>
           <w:p>
             <w:r/>
@@ -2501,7 +2776,7 @@
         </w:tc>
         <w:tc>
           <w:tcPr>
-            <w:tcW w:type="dxa" w:w="2304"/>
+            <w:tcW w:type="dxa" w:w="2160"/>
           </w:tcPr>
           <w:p>
             <w:r/>
@@ -2548,7 +2823,7 @@
         </w:tc>
         <w:tc>
           <w:tcPr>
-            <w:tcW w:type="dxa" w:w="3312"/>
+            <w:tcW w:type="dxa" w:w="3456"/>
           </w:tcPr>
           <w:p>
             <w:r/>
@@ -2563,7 +2838,7 @@
         </w:tc>
         <w:tc>
           <w:tcPr>
-            <w:tcW w:type="dxa" w:w="2304"/>
+            <w:tcW w:type="dxa" w:w="2160"/>
           </w:tcPr>
           <w:p>
             <w:r/>
@@ -2610,7 +2885,7 @@
         </w:tc>
         <w:tc>
           <w:tcPr>
-            <w:tcW w:type="dxa" w:w="3312"/>
+            <w:tcW w:type="dxa" w:w="3456"/>
           </w:tcPr>
           <w:p>
             <w:r/>
@@ -2625,7 +2900,7 @@
         </w:tc>
         <w:tc>
           <w:tcPr>
-            <w:tcW w:type="dxa" w:w="2304"/>
+            <w:tcW w:type="dxa" w:w="2160"/>
           </w:tcPr>
           <w:p>
             <w:r/>
@@ -2649,7 +2924,7 @@
                 <w:b w:val="0"/>
                 <w:sz w:val="20"/>
               </w:rPr>
-              <w:t>Seal a paper (encrypt + Shamir-split the key)</w:t>
+              <w:t>Seal a paper/manifest (encrypt + Shamir-split the key)</w:t>
             </w:r>
           </w:p>
         </w:tc>
@@ -2672,7 +2947,7 @@
         </w:tc>
         <w:tc>
           <w:tcPr>
-            <w:tcW w:type="dxa" w:w="3312"/>
+            <w:tcW w:type="dxa" w:w="3456"/>
           </w:tcPr>
           <w:p>
             <w:r/>
@@ -2687,7 +2962,7 @@
         </w:tc>
         <w:tc>
           <w:tcPr>
-            <w:tcW w:type="dxa" w:w="2304"/>
+            <w:tcW w:type="dxa" w:w="2160"/>
           </w:tcPr>
           <w:p>
             <w:r/>
@@ -2734,7 +3009,7 @@
         </w:tc>
         <w:tc>
           <w:tcPr>
-            <w:tcW w:type="dxa" w:w="3312"/>
+            <w:tcW w:type="dxa" w:w="3456"/>
           </w:tcPr>
           <w:p>
             <w:r/>
@@ -2749,7 +3024,7 @@
         </w:tc>
         <w:tc>
           <w:tcPr>
-            <w:tcW w:type="dxa" w:w="2304"/>
+            <w:tcW w:type="dxa" w:w="2160"/>
           </w:tcPr>
           <w:p>
             <w:r/>
@@ -2796,7 +3071,7 @@
         </w:tc>
         <w:tc>
           <w:tcPr>
-            <w:tcW w:type="dxa" w:w="3312"/>
+            <w:tcW w:type="dxa" w:w="3456"/>
           </w:tcPr>
           <w:p>
             <w:r/>
@@ -2811,7 +3086,7 @@
         </w:tc>
         <w:tc>
           <w:tcPr>
-            <w:tcW w:type="dxa" w:w="2304"/>
+            <w:tcW w:type="dxa" w:w="2160"/>
           </w:tcPr>
           <w:p>
             <w:r/>
@@ -2858,7 +3133,69 @@
         </w:tc>
         <w:tc>
           <w:tcPr>
-            <w:tcW w:type="dxa" w:w="3312"/>
+            <w:tcW w:type="dxa" w:w="3456"/>
+          </w:tcPr>
+          <w:p>
+            <w:r/>
+            <w:r>
+              <w:rPr>
+                <w:b w:val="0"/>
+                <w:sz w:val="20"/>
+              </w:rPr>
+              <w:t>/exams/{id}/blueprint</w:t>
+            </w:r>
+          </w:p>
+        </w:tc>
+        <w:tc>
+          <w:tcPr>
+            <w:tcW w:type="dxa" w:w="2160"/>
+          </w:tcPr>
+          <w:p>
+            <w:r/>
+            <w:r>
+              <w:rPr>
+                <w:b w:val="0"/>
+                <w:sz w:val="20"/>
+              </w:rPr>
+              <w:t>any</w:t>
+            </w:r>
+          </w:p>
+        </w:tc>
+        <w:tc>
+          <w:tcPr>
+            <w:tcW w:type="dxa" w:w="2736"/>
+          </w:tcPr>
+          <w:p>
+            <w:r/>
+            <w:r>
+              <w:rPr>
+                <w:b w:val="0"/>
+                <w:sz w:val="20"/>
+              </w:rPr>
+              <w:t>Dynamic exam structure (counts, not content)</w:t>
+            </w:r>
+          </w:p>
+        </w:tc>
+      </w:tr>
+      <w:tr>
+        <w:tc>
+          <w:tcPr>
+            <w:tcW w:type="dxa" w:w="1008"/>
+          </w:tcPr>
+          <w:p>
+            <w:r/>
+            <w:r>
+              <w:rPr>
+                <w:b w:val="0"/>
+                <w:sz w:val="20"/>
+              </w:rPr>
+              <w:t>GET</w:t>
+            </w:r>
+          </w:p>
+        </w:tc>
+        <w:tc>
+          <w:tcPr>
+            <w:tcW w:type="dxa" w:w="3456"/>
           </w:tcPr>
           <w:p>
             <w:r/>
@@ -2873,7 +3210,7 @@
         </w:tc>
         <w:tc>
           <w:tcPr>
-            <w:tcW w:type="dxa" w:w="2304"/>
+            <w:tcW w:type="dxa" w:w="2160"/>
           </w:tcPr>
           <w:p>
             <w:r/>
@@ -2920,7 +3257,7 @@
         </w:tc>
         <w:tc>
           <w:tcPr>
-            <w:tcW w:type="dxa" w:w="3312"/>
+            <w:tcW w:type="dxa" w:w="3456"/>
           </w:tcPr>
           <w:p>
             <w:r/>
@@ -2935,7 +3272,7 @@
         </w:tc>
         <w:tc>
           <w:tcPr>
-            <w:tcW w:type="dxa" w:w="2304"/>
+            <w:tcW w:type="dxa" w:w="2160"/>
           </w:tcPr>
           <w:p>
             <w:r/>
@@ -2982,7 +3319,7 @@
         </w:tc>
         <w:tc>
           <w:tcPr>
-            <w:tcW w:type="dxa" w:w="3312"/>
+            <w:tcW w:type="dxa" w:w="3456"/>
           </w:tcPr>
           <w:p>
             <w:r/>
@@ -2997,7 +3334,7 @@
         </w:tc>
         <w:tc>
           <w:tcPr>
-            <w:tcW w:type="dxa" w:w="2304"/>
+            <w:tcW w:type="dxa" w:w="2160"/>
           </w:tcPr>
           <w:p>
             <w:r/>
@@ -3021,7 +3358,7 @@
                 <w:b w:val="0"/>
                 <w:sz w:val="20"/>
               </w:rPr>
-              <w:t>Read released paper text (post-gate only)</w:t>
+              <w:t>Read released paper (assembled per-candidate if dynamic)</w:t>
             </w:r>
           </w:p>
         </w:tc>
@@ -3044,7 +3381,7 @@
         </w:tc>
         <w:tc>
           <w:tcPr>
-            <w:tcW w:type="dxa" w:w="3312"/>
+            <w:tcW w:type="dxa" w:w="3456"/>
           </w:tcPr>
           <w:p>
             <w:r/>
@@ -3059,7 +3396,7 @@
         </w:tc>
         <w:tc>
           <w:tcPr>
-            <w:tcW w:type="dxa" w:w="2304"/>
+            <w:tcW w:type="dxa" w:w="2160"/>
           </w:tcPr>
           <w:p>
             <w:r/>
@@ -3106,7 +3443,131 @@
         </w:tc>
         <w:tc>
           <w:tcPr>
-            <w:tcW w:type="dxa" w:w="3312"/>
+            <w:tcW w:type="dxa" w:w="3456"/>
+          </w:tcPr>
+          <w:p>
+            <w:r/>
+            <w:r>
+              <w:rPr>
+                <w:b w:val="0"/>
+                <w:sz w:val="20"/>
+              </w:rPr>
+              <w:t>/questions</w:t>
+            </w:r>
+          </w:p>
+        </w:tc>
+        <w:tc>
+          <w:tcPr>
+            <w:tcW w:type="dxa" w:w="2160"/>
+          </w:tcPr>
+          <w:p>
+            <w:r/>
+            <w:r>
+              <w:rPr>
+                <w:b w:val="0"/>
+                <w:sz w:val="20"/>
+              </w:rPr>
+              <w:t>admin</w:t>
+            </w:r>
+          </w:p>
+        </w:tc>
+        <w:tc>
+          <w:tcPr>
+            <w:tcW w:type="dxa" w:w="2736"/>
+          </w:tcPr>
+          <w:p>
+            <w:r/>
+            <w:r>
+              <w:rPr>
+                <w:b w:val="0"/>
+                <w:sz w:val="20"/>
+              </w:rPr>
+              <w:t>Add one AES-GCM-encrypted question to the bank</w:t>
+            </w:r>
+          </w:p>
+        </w:tc>
+      </w:tr>
+      <w:tr>
+        <w:tc>
+          <w:tcPr>
+            <w:tcW w:type="dxa" w:w="1008"/>
+          </w:tcPr>
+          <w:p>
+            <w:r/>
+            <w:r>
+              <w:rPr>
+                <w:b w:val="0"/>
+                <w:sz w:val="20"/>
+              </w:rPr>
+              <w:t>GET</w:t>
+            </w:r>
+          </w:p>
+        </w:tc>
+        <w:tc>
+          <w:tcPr>
+            <w:tcW w:type="dxa" w:w="3456"/>
+          </w:tcPr>
+          <w:p>
+            <w:r/>
+            <w:r>
+              <w:rPr>
+                <w:b w:val="0"/>
+                <w:sz w:val="20"/>
+              </w:rPr>
+              <w:t>/questions</w:t>
+            </w:r>
+          </w:p>
+        </w:tc>
+        <w:tc>
+          <w:tcPr>
+            <w:tcW w:type="dxa" w:w="2160"/>
+          </w:tcPr>
+          <w:p>
+            <w:r/>
+            <w:r>
+              <w:rPr>
+                <w:b w:val="0"/>
+                <w:sz w:val="20"/>
+              </w:rPr>
+              <w:t>admin</w:t>
+            </w:r>
+          </w:p>
+        </w:tc>
+        <w:tc>
+          <w:tcPr>
+            <w:tcW w:type="dxa" w:w="2736"/>
+          </w:tcPr>
+          <w:p>
+            <w:r/>
+            <w:r>
+              <w:rPr>
+                <w:b w:val="0"/>
+                <w:sz w:val="20"/>
+              </w:rPr>
+              <w:t>List bank metadata only (never bodies)</w:t>
+            </w:r>
+          </w:p>
+        </w:tc>
+      </w:tr>
+      <w:tr>
+        <w:tc>
+          <w:tcPr>
+            <w:tcW w:type="dxa" w:w="1008"/>
+          </w:tcPr>
+          <w:p>
+            <w:r/>
+            <w:r>
+              <w:rPr>
+                <w:b w:val="0"/>
+                <w:sz w:val="20"/>
+              </w:rPr>
+              <w:t>POST</w:t>
+            </w:r>
+          </w:p>
+        </w:tc>
+        <w:tc>
+          <w:tcPr>
+            <w:tcW w:type="dxa" w:w="3456"/>
           </w:tcPr>
           <w:p>
             <w:r/>
@@ -3121,7 +3582,7 @@
         </w:tc>
         <w:tc>
           <w:tcPr>
-            <w:tcW w:type="dxa" w:w="2304"/>
+            <w:tcW w:type="dxa" w:w="2160"/>
           </w:tcPr>
           <w:p>
             <w:r/>
@@ -3162,13 +3623,75 @@
                 <w:b w:val="0"/>
                 <w:sz w:val="20"/>
               </w:rPr>
+              <w:t>POST</w:t>
+            </w:r>
+          </w:p>
+        </w:tc>
+        <w:tc>
+          <w:tcPr>
+            <w:tcW w:type="dxa" w:w="3456"/>
+          </w:tcPr>
+          <w:p>
+            <w:r/>
+            <w:r>
+              <w:rPr>
+                <w:b w:val="0"/>
+                <w:sz w:val="20"/>
+              </w:rPr>
+              <w:t>/investigator/match</w:t>
+            </w:r>
+          </w:p>
+        </w:tc>
+        <w:tc>
+          <w:tcPr>
+            <w:tcW w:type="dxa" w:w="2160"/>
+          </w:tcPr>
+          <w:p>
+            <w:r/>
+            <w:r>
+              <w:rPr>
+                <w:b w:val="0"/>
+                <w:sz w:val="20"/>
+              </w:rPr>
+              <w:t>investigator/admin</w:t>
+            </w:r>
+          </w:p>
+        </w:tc>
+        <w:tc>
+          <w:tcPr>
+            <w:tcW w:type="dxa" w:w="2736"/>
+          </w:tcPr>
+          <w:p>
+            <w:r/>
+            <w:r>
+              <w:rPr>
+                <w:b w:val="0"/>
+                <w:sz w:val="20"/>
+              </w:rPr>
+              <w:t>Match leaked text to bank + narrow the source</w:t>
+            </w:r>
+          </w:p>
+        </w:tc>
+      </w:tr>
+      <w:tr>
+        <w:tc>
+          <w:tcPr>
+            <w:tcW w:type="dxa" w:w="1008"/>
+          </w:tcPr>
+          <w:p>
+            <w:r/>
+            <w:r>
+              <w:rPr>
+                <w:b w:val="0"/>
+                <w:sz w:val="20"/>
+              </w:rPr>
               <w:t>GET</w:t>
             </w:r>
           </w:p>
         </w:tc>
         <w:tc>
           <w:tcPr>
-            <w:tcW w:type="dxa" w:w="3312"/>
+            <w:tcW w:type="dxa" w:w="3456"/>
           </w:tcPr>
           <w:p>
             <w:r/>
@@ -3183,7 +3706,7 @@
         </w:tc>
         <w:tc>
           <w:tcPr>
-            <w:tcW w:type="dxa" w:w="2304"/>
+            <w:tcW w:type="dxa" w:w="2160"/>
           </w:tcPr>
           <w:p>
             <w:r/>
@@ -3230,7 +3753,7 @@
         </w:tc>
         <w:tc>
           <w:tcPr>
-            <w:tcW w:type="dxa" w:w="3312"/>
+            <w:tcW w:type="dxa" w:w="3456"/>
           </w:tcPr>
           <w:p>
             <w:r/>
@@ -3245,7 +3768,7 @@
         </w:tc>
         <w:tc>
           <w:tcPr>
-            <w:tcW w:type="dxa" w:w="2304"/>
+            <w:tcW w:type="dxa" w:w="2160"/>
           </w:tcPr>
           <w:p>
             <w:r/>
@@ -3291,7 +3814,7 @@
         <w:rPr>
           <w:color w:val="0E7A8C"/>
         </w:rPr>
-        <w:t>12.  The Frontend — Four Role Dashboards</w:t>
+        <w:t>13.  The Frontend — Four Role Dashboards</w:t>
       </w:r>
     </w:p>
     <w:p>
@@ -3318,7 +3841,7 @@
         <w:rPr>
           <w:sz w:val="22"/>
         </w:rPr>
-        <w:t>Seal an exam (name, subject, center, threshold, release window), browse sealed exams, and watch a live operations panel: the vault animation, the share quorum, the encryption badge, and the time-gate countdown — all polled from the real backend every 1.5 seconds.</w:t>
+        <w:t>Seal an exam (name, subject, center, threshold, release window), browse sealed exams, and watch a live operations panel: the vault animation, the share quorum, the encryption badge, and the time-gate countdown — all polled from the real backend every 1.5 seconds. A Static/Dynamic toggle switches the seal form to a blueprint editor for dynamic exams, and the operations panel shows a live "dynamic assembly" strip (bank pool + per-candidate count).</w:t>
       </w:r>
     </w:p>
     <w:p>
@@ -3375,7 +3898,7 @@
         <w:rPr>
           <w:sz w:val="22"/>
         </w:rPr>
-        <w:t>Drag-drop a leaked image to trace it to a candidate (with confidence bar and bit distance), and click "Verify Integrity" to recompute the SHA-256 ledger and confirm it is intact — broken events would be highlighted in red.</w:t>
+        <w:t>Three tools in one console: a Leak-Match Detector (paste suspected leaked text to see the matched bank questions with containment scores and a ranked suspect list); a Forensic Trace (drag-drop a leaked image to trace it to a candidate, with confidence bar and bit distance); and the Audit Ledger — click "Verify Integrity" to recompute the SHA-256 chain and confirm it is intact, with any broken events highlighted in red.</w:t>
       </w:r>
     </w:p>
     <w:p>
@@ -3405,7 +3928,7 @@
         <w:rPr>
           <w:color w:val="0E7A8C"/>
         </w:rPr>
-        <w:t>13.  Security Model &amp; Trust Boundary</w:t>
+        <w:t>14.  Security Model &amp; Trust Boundary</w:t>
       </w:r>
     </w:p>
     <w:p>
@@ -3549,7 +4072,7 @@
         <w:rPr>
           <w:color w:val="0E7A8C"/>
         </w:rPr>
-        <w:t>14.  Testing &amp; Verification</w:t>
+        <w:t>15.  Testing &amp; Verification</w:t>
       </w:r>
     </w:p>
     <w:p>
@@ -3557,7 +4080,7 @@
         <w:rPr>
           <w:sz w:val="22"/>
         </w:rPr>
-        <w:t>Correctness is proven by an automated test suite (~816 lines, 8 files) covering the parts that matter most:</w:t>
+        <w:t>Correctness is proven by an automated test suite — 81 tests passing — covering the parts that matter most:</w:t>
       </w:r>
     </w:p>
     <w:tbl>
@@ -3779,6 +4302,70 @@
                 <w:b w:val="0"/>
                 <w:sz w:val="20"/>
               </w:rPr>
+              <w:t>Dynamic assembly</w:t>
+            </w:r>
+          </w:p>
+        </w:tc>
+        <w:tc>
+          <w:tcPr>
+            <w:tcW w:type="dxa" w:w="7056"/>
+          </w:tcPr>
+          <w:p>
+            <w:r/>
+            <w:r>
+              <w:rPr>
+                <w:b w:val="0"/>
+                <w:sz w:val="20"/>
+              </w:rPr>
+              <w:t>Determinism, distinctness across candidates, blueprint counts, no plaintext at rest, release gating, post-seal immutability</w:t>
+            </w:r>
+          </w:p>
+        </w:tc>
+      </w:tr>
+      <w:tr>
+        <w:tc>
+          <w:tcPr>
+            <w:tcW w:type="dxa" w:w="2304"/>
+          </w:tcPr>
+          <w:p>
+            <w:r/>
+            <w:r>
+              <w:rPr>
+                <w:b w:val="0"/>
+                <w:sz w:val="20"/>
+              </w:rPr>
+              <w:t>Leak-match</w:t>
+            </w:r>
+          </w:p>
+        </w:tc>
+        <w:tc>
+          <w:tcPr>
+            <w:tcW w:type="dxa" w:w="7056"/>
+          </w:tcPr>
+          <w:p>
+            <w:r/>
+            <w:r>
+              <w:rPr>
+                <w:b w:val="0"/>
+                <w:sz w:val="20"/>
+              </w:rPr>
+              <w:t>Exact-text match, no-match on unrelated text, owner-is-strongest-lead, role enforcement, audit</w:t>
+            </w:r>
+          </w:p>
+        </w:tc>
+      </w:tr>
+      <w:tr>
+        <w:tc>
+          <w:tcPr>
+            <w:tcW w:type="dxa" w:w="2304"/>
+          </w:tcPr>
+          <w:p>
+            <w:r/>
+            <w:r>
+              <w:rPr>
+                <w:b w:val="0"/>
+                <w:sz w:val="20"/>
+              </w:rPr>
               <w:t>API flow</w:t>
             </w:r>
           </w:p>
@@ -3816,7 +4403,7 @@
         <w:rPr>
           <w:color w:val="0E7A8C"/>
         </w:rPr>
-        <w:t>15.  How to Run It Yourself</w:t>
+        <w:t>16.  How to Run It Yourself</w:t>
       </w:r>
     </w:p>
     <w:p>
@@ -3941,7 +4528,7 @@
         <w:rPr>
           <w:color w:val="0E7A8C"/>
         </w:rPr>
-        <w:t>16.  Build Status (Milestones)</w:t>
+        <w:t>17.  Build Status (Milestones)</w:t>
       </w:r>
     </w:p>
     <w:tbl>
@@ -3959,7 +4546,7 @@
       <w:tr>
         <w:tc>
           <w:tcPr>
-            <w:tcW w:type="dxa" w:w="1296"/>
+            <w:tcW w:type="dxa" w:w="1872"/>
             <w:shd w:val="clear" w:color="auto" w:fill="0E7A8C"/>
           </w:tcPr>
           <w:p>
@@ -3976,7 +4563,7 @@
         </w:tc>
         <w:tc>
           <w:tcPr>
-            <w:tcW w:type="dxa" w:w="6336"/>
+            <w:tcW w:type="dxa" w:w="5760"/>
             <w:shd w:val="clear" w:color="auto" w:fill="0E7A8C"/>
           </w:tcPr>
           <w:p>
@@ -4012,7 +4599,7 @@
       <w:tr>
         <w:tc>
           <w:tcPr>
-            <w:tcW w:type="dxa" w:w="1296"/>
+            <w:tcW w:type="dxa" w:w="1872"/>
           </w:tcPr>
           <w:p>
             <w:r/>
@@ -4027,7 +4614,7 @@
         </w:tc>
         <w:tc>
           <w:tcPr>
-            <w:tcW w:type="dxa" w:w="6336"/>
+            <w:tcW w:type="dxa" w:w="5760"/>
           </w:tcPr>
           <w:p>
             <w:r/>
@@ -4059,7 +4646,7 @@
       <w:tr>
         <w:tc>
           <w:tcPr>
-            <w:tcW w:type="dxa" w:w="1296"/>
+            <w:tcW w:type="dxa" w:w="1872"/>
           </w:tcPr>
           <w:p>
             <w:r/>
@@ -4074,7 +4661,7 @@
         </w:tc>
         <w:tc>
           <w:tcPr>
-            <w:tcW w:type="dxa" w:w="6336"/>
+            <w:tcW w:type="dxa" w:w="5760"/>
           </w:tcPr>
           <w:p>
             <w:r/>
@@ -4106,7 +4693,7 @@
       <w:tr>
         <w:tc>
           <w:tcPr>
-            <w:tcW w:type="dxa" w:w="1296"/>
+            <w:tcW w:type="dxa" w:w="1872"/>
           </w:tcPr>
           <w:p>
             <w:r/>
@@ -4121,7 +4708,7 @@
         </w:tc>
         <w:tc>
           <w:tcPr>
-            <w:tcW w:type="dxa" w:w="6336"/>
+            <w:tcW w:type="dxa" w:w="5760"/>
           </w:tcPr>
           <w:p>
             <w:r/>
@@ -4153,7 +4740,7 @@
       <w:tr>
         <w:tc>
           <w:tcPr>
-            <w:tcW w:type="dxa" w:w="1296"/>
+            <w:tcW w:type="dxa" w:w="1872"/>
           </w:tcPr>
           <w:p>
             <w:r/>
@@ -4168,7 +4755,7 @@
         </w:tc>
         <w:tc>
           <w:tcPr>
-            <w:tcW w:type="dxa" w:w="6336"/>
+            <w:tcW w:type="dxa" w:w="5760"/>
           </w:tcPr>
           <w:p>
             <w:r/>
@@ -4200,7 +4787,7 @@
       <w:tr>
         <w:tc>
           <w:tcPr>
-            <w:tcW w:type="dxa" w:w="1296"/>
+            <w:tcW w:type="dxa" w:w="1872"/>
           </w:tcPr>
           <w:p>
             <w:r/>
@@ -4215,7 +4802,7 @@
         </w:tc>
         <w:tc>
           <w:tcPr>
-            <w:tcW w:type="dxa" w:w="6336"/>
+            <w:tcW w:type="dxa" w:w="5760"/>
           </w:tcPr>
           <w:p>
             <w:r/>
@@ -4247,7 +4834,101 @@
       <w:tr>
         <w:tc>
           <w:tcPr>
-            <w:tcW w:type="dxa" w:w="1296"/>
+            <w:tcW w:type="dxa" w:w="1872"/>
+          </w:tcPr>
+          <w:p>
+            <w:r/>
+            <w:r>
+              <w:rPr>
+                <w:b w:val="0"/>
+                <w:sz w:val="20"/>
+              </w:rPr>
+              <w:t>Dynamic assembly</w:t>
+            </w:r>
+          </w:p>
+        </w:tc>
+        <w:tc>
+          <w:tcPr>
+            <w:tcW w:type="dxa" w:w="5760"/>
+          </w:tcPr>
+          <w:p>
+            <w:r/>
+            <w:r>
+              <w:rPr>
+                <w:b w:val="0"/>
+                <w:sz w:val="20"/>
+              </w:rPr>
+              <w:t>Encrypted question bank + per-candidate paper assembly (leak-resistance layer)</w:t>
+            </w:r>
+          </w:p>
+        </w:tc>
+        <w:tc>
+          <w:tcPr>
+            <w:tcW w:type="dxa" w:w="1728"/>
+          </w:tcPr>
+          <w:p>
+            <w:r/>
+            <w:r>
+              <w:rPr>
+                <w:b w:val="0"/>
+                <w:sz w:val="20"/>
+              </w:rPr>
+              <w:t>Done</w:t>
+            </w:r>
+          </w:p>
+        </w:tc>
+      </w:tr>
+      <w:tr>
+        <w:tc>
+          <w:tcPr>
+            <w:tcW w:type="dxa" w:w="1872"/>
+          </w:tcPr>
+          <w:p>
+            <w:r/>
+            <w:r>
+              <w:rPr>
+                <w:b w:val="0"/>
+                <w:sz w:val="20"/>
+              </w:rPr>
+              <w:t>Leak-match</w:t>
+            </w:r>
+          </w:p>
+        </w:tc>
+        <w:tc>
+          <w:tcPr>
+            <w:tcW w:type="dxa" w:w="5760"/>
+          </w:tcPr>
+          <w:p>
+            <w:r/>
+            <w:r>
+              <w:rPr>
+                <w:b w:val="0"/>
+                <w:sz w:val="20"/>
+              </w:rPr>
+              <w:t>Text-leak detector: match to bank + narrow the source</w:t>
+            </w:r>
+          </w:p>
+        </w:tc>
+        <w:tc>
+          <w:tcPr>
+            <w:tcW w:type="dxa" w:w="1728"/>
+          </w:tcPr>
+          <w:p>
+            <w:r/>
+            <w:r>
+              <w:rPr>
+                <w:b w:val="0"/>
+                <w:sz w:val="20"/>
+              </w:rPr>
+              <w:t>Done</w:t>
+            </w:r>
+          </w:p>
+        </w:tc>
+      </w:tr>
+      <w:tr>
+        <w:tc>
+          <w:tcPr>
+            <w:tcW w:type="dxa" w:w="1872"/>
           </w:tcPr>
           <w:p>
             <w:r/>
@@ -4262,7 +4943,7 @@
         </w:tc>
         <w:tc>
           <w:tcPr>
-            <w:tcW w:type="dxa" w:w="6336"/>
+            <w:tcW w:type="dxa" w:w="5760"/>
           </w:tcPr>
           <w:p>
             <w:r/>
@@ -4294,7 +4975,7 @@
       <w:tr>
         <w:tc>
           <w:tcPr>
-            <w:tcW w:type="dxa" w:w="1296"/>
+            <w:tcW w:type="dxa" w:w="1872"/>
           </w:tcPr>
           <w:p>
             <w:r/>
@@ -4309,7 +4990,7 @@
         </w:tc>
         <w:tc>
           <w:tcPr>
-            <w:tcW w:type="dxa" w:w="6336"/>
+            <w:tcW w:type="dxa" w:w="5760"/>
           </w:tcPr>
           <w:p>
             <w:r/>
@@ -4347,7 +5028,7 @@
         <w:rPr>
           <w:color w:val="0E7A8C"/>
         </w:rPr>
-        <w:t>17.  Project Layout</w:t>
+        <w:t>18.  Project Layout</w:t>
       </w:r>
     </w:p>
     <w:p>
@@ -4376,13 +5057,13 @@
         <w:br/>
         <w:t>|  |  |- watermark/  core(DCT) . render . trace      &lt;- watermarking</w:t>
         <w:br/>
-        <w:t>|  |  |- services/   exams.py  (seal . unlock . serve)</w:t>
+        <w:t>|  |  |- services/   exams.py . assembly.py (dynamic bank) . leakmatch.py . watermarking.py</w:t>
         <w:br/>
-        <w:t>|  |  |- api/        app.py + routers/ (auth . exams . investigator . audit)</w:t>
+        <w:t>|  |  |- api/        app.py + routers/ (auth . exams . questions . investigator . audit)</w:t>
         <w:br/>
         <w:t>|  |  |- models.py . schemas.py . db.py . config.py . bootstrap.py</w:t>
         <w:br/>
-        <w:t>|  |- tests/         gf256 . shamir . aes_gcm . watermark . audit_chain . api</w:t>
+        <w:t>|  |- tests/         gf256 . shamir . aes_gcm . watermark . audit_chain . api . assembly . leakmatch</w:t>
         <w:br/>
         <w:t>|  |- cli/           crypto_demo.py . api_demo.py . watermark_demo.py</w:t>
         <w:br/>
@@ -4411,7 +5092,7 @@
         <w:rPr>
           <w:color w:val="0E7A8C"/>
         </w:rPr>
-        <w:t>18.  Glossary</w:t>
+        <w:t>19.  Glossary</w:t>
       </w:r>
     </w:p>
     <w:tbl>
@@ -4813,6 +5494,102 @@
           </w:p>
         </w:tc>
       </w:tr>
+      <w:tr>
+        <w:tc>
+          <w:tcPr>
+            <w:tcW w:type="dxa" w:w="2592"/>
+          </w:tcPr>
+          <w:p>
+            <w:r/>
+            <w:r>
+              <w:rPr>
+                <w:b w:val="0"/>
+                <w:sz w:val="20"/>
+              </w:rPr>
+              <w:t>Dynamic assembly</w:t>
+            </w:r>
+          </w:p>
+        </w:tc>
+        <w:tc>
+          <w:tcPr>
+            <w:tcW w:type="dxa" w:w="6768"/>
+          </w:tcPr>
+          <w:p>
+            <w:r/>
+            <w:r>
+              <w:rPr>
+                <w:b w:val="0"/>
+                <w:sz w:val="20"/>
+              </w:rPr>
+              <w:t>Building each candidate's paper on demand from a bank of encrypted questions, so no full paper exists before release.</w:t>
+            </w:r>
+          </w:p>
+        </w:tc>
+      </w:tr>
+      <w:tr>
+        <w:tc>
+          <w:tcPr>
+            <w:tcW w:type="dxa" w:w="2592"/>
+          </w:tcPr>
+          <w:p>
+            <w:r/>
+            <w:r>
+              <w:rPr>
+                <w:b w:val="0"/>
+                <w:sz w:val="20"/>
+              </w:rPr>
+              <w:t>Blueprint</w:t>
+            </w:r>
+          </w:p>
+        </w:tc>
+        <w:tc>
+          <w:tcPr>
+            <w:tcW w:type="dxa" w:w="6768"/>
+          </w:tcPr>
+          <w:p>
+            <w:r/>
+            <w:r>
+              <w:rPr>
+                <w:b w:val="0"/>
+                <w:sz w:val="20"/>
+              </w:rPr>
+              <w:t>The recipe for a dynamic exam: which sections, topics, difficulties, and how many questions each.</w:t>
+            </w:r>
+          </w:p>
+        </w:tc>
+      </w:tr>
+      <w:tr>
+        <w:tc>
+          <w:tcPr>
+            <w:tcW w:type="dxa" w:w="2592"/>
+          </w:tcPr>
+          <w:p>
+            <w:r/>
+            <w:r>
+              <w:rPr>
+                <w:b w:val="0"/>
+                <w:sz w:val="20"/>
+              </w:rPr>
+              <w:t>Containment match</w:t>
+            </w:r>
+          </w:p>
+        </w:tc>
+        <w:tc>
+          <w:tcPr>
+            <w:tcW w:type="dxa" w:w="6768"/>
+          </w:tcPr>
+          <w:p>
+            <w:r/>
+            <w:r>
+              <w:rPr>
+                <w:b w:val="0"/>
+                <w:sz w:val="20"/>
+              </w:rPr>
+              <w:t>A similarity measure: what fraction of a question's words appear in a leaked text — used to detect text leaks.</w:t>
+            </w:r>
+          </w:p>
+        </w:tc>
+      </w:tr>
     </w:tbl>
     <w:p/>
     <w:p>

</xml_diff>

<commit_message>
docs: add 2–4 min video demo script (DEMO_SCRIPT.md + doc appendix)
Presenter-ready narration following the "Option 2 Video" rubric — problem,
solution, features, and a live demo walkthrough — so judges understand the whole
project from the video alone. SAY/SHOW beats with timecodes, a pre-record
checklist, demo logins, and an "is the crypto real?" answer.

- DEMO_SCRIPT.md at the repo root (full script + checklist).
- Section 20 appendix in the Word/PDF documentation; regenerated .docx/.pdf.

Co-Authored-By: Claude Opus 4.8 (1M context) <noreply@anthropic.com>
</commit_message>
<xml_diff>
--- a/Trace_Project_Documentation.docx
+++ b/Trace_Project_Documentation.docx
@@ -303,6 +303,17 @@
           <w:sz w:val="22"/>
         </w:rPr>
         <w:t>19. Glossary</w:t>
+      </w:r>
+    </w:p>
+    <w:p>
+      <w:pPr>
+        <w:spacing w:after="60"/>
+      </w:pPr>
+      <w:r>
+        <w:rPr>
+          <w:sz w:val="22"/>
+        </w:rPr>
+        <w:t>20. Appendix — Video Demo Script (2–4 min)</w:t>
       </w:r>
     </w:p>
     <w:p>
@@ -5591,6 +5602,337 @@
         </w:tc>
       </w:tr>
     </w:tbl>
+    <w:p>
+      <w:pPr>
+        <w:pStyle w:val="Heading1"/>
+      </w:pPr>
+      <w:r>
+        <w:rPr>
+          <w:color w:val="0E7A8C"/>
+        </w:rPr>
+        <w:t>20.  Appendix — Video Demo Script (2–4 min)</w:t>
+      </w:r>
+    </w:p>
+    <w:p>
+      <w:r>
+        <w:rPr>
+          <w:sz w:val="22"/>
+        </w:rPr>
+        <w:t>A ready-to-record narration for a short demo video so a judge understands the whole project from the video alone. SAY = narration; SHOW = on-screen action. The full script with a presenter checklist is also in DEMO_SCRIPT.md at the repo root.</w:t>
+      </w:r>
+    </w:p>
+    <w:p>
+      <w:r>
+        <w:rPr>
+          <w:b/>
+          <w:color w:val="0E7A8C"/>
+        </w:rPr>
+        <w:t>0:00–0:20  Hook</w:t>
+      </w:r>
+    </w:p>
+    <w:p>
+      <w:pPr>
+        <w:pStyle w:val="ListBullet"/>
+      </w:pPr>
+      <w:r>
+        <w:rPr>
+          <w:b/>
+          <w:color w:val="0E7A8C"/>
+        </w:rPr>
+        <w:t>SAY —</w:t>
+      </w:r>
+      <w:r>
+        <w:t xml:space="preserve">  Every year, exam-paper leaks destroy the careers of millions of honest students. One insider with early access can compromise an entire exam — and once it's out, nobody can prove whose copy it was. This is Trace: a paper impossible to open before the exam, and traceable to its exact source if it ever leaks.</w:t>
+      </w:r>
+    </w:p>
+    <w:p>
+      <w:pPr>
+        <w:pStyle w:val="ListBullet"/>
+      </w:pPr>
+      <w:r>
+        <w:rPr>
+          <w:b/>
+          <w:color w:val="0E7A8C"/>
+        </w:rPr>
+        <w:t>SHOW —</w:t>
+      </w:r>
+      <w:r>
+        <w:t xml:space="preserve">  Title screen / the Trace dashboard header.</w:t>
+      </w:r>
+    </w:p>
+    <w:p>
+      <w:r>
+        <w:rPr>
+          <w:b/>
+          <w:color w:val="0E7A8C"/>
+        </w:rPr>
+        <w:t>0:20–0:45  Problem</w:t>
+      </w:r>
+    </w:p>
+    <w:p>
+      <w:pPr>
+        <w:pStyle w:val="ListBullet"/>
+      </w:pPr>
+      <w:r>
+        <w:rPr>
+          <w:b/>
+          <w:color w:val="0E7A8C"/>
+        </w:rPr>
+        <w:t>SAY —</w:t>
+      </w:r>
+      <w:r>
+        <w:t xml:space="preserve">  Two things go wrong: the insider leak (someone opens the paper early), and the accountability gap (no way to trace a leaked copy back to its source).</w:t>
+      </w:r>
+    </w:p>
+    <w:p>
+      <w:pPr>
+        <w:pStyle w:val="ListBullet"/>
+      </w:pPr>
+      <w:r>
+        <w:rPr>
+          <w:b/>
+          <w:color w:val="0E7A8C"/>
+        </w:rPr>
+        <w:t>SHOW —</w:t>
+      </w:r>
+      <w:r>
+        <w:t xml:space="preserve">  A problem slide, or stay on the dashboard.</w:t>
+      </w:r>
+    </w:p>
+    <w:p>
+      <w:r>
+        <w:rPr>
+          <w:b/>
+          <w:color w:val="0E7A8C"/>
+        </w:rPr>
+        <w:t>0:45–1:15  Solution</w:t>
+      </w:r>
+    </w:p>
+    <w:p>
+      <w:pPr>
+        <w:pStyle w:val="ListBullet"/>
+      </w:pPr>
+      <w:r>
+        <w:rPr>
+          <w:b/>
+          <w:color w:val="0E7A8C"/>
+        </w:rPr>
+        <w:t>SAY —</w:t>
+      </w:r>
+      <w:r>
+        <w:t xml:space="preserve">  Three real guarantees: AES-256 + Shamir 3-of-5 across five custodians + a server time lock; an invisible per-candidate watermark that survives a screen photo; and a tamper-evident SHA-256 audit log. Plus two leak-crushing layers: dynamic per-candidate papers and a leak-match detector.</w:t>
+      </w:r>
+    </w:p>
+    <w:p>
+      <w:pPr>
+        <w:pStyle w:val="ListBullet"/>
+      </w:pPr>
+      <w:r>
+        <w:rPr>
+          <w:b/>
+          <w:color w:val="0E7A8C"/>
+        </w:rPr>
+        <w:t>SHOW —</w:t>
+      </w:r>
+      <w:r>
+        <w:t xml:space="preserve">  Scroll the four role chips in the role-switcher.</w:t>
+      </w:r>
+    </w:p>
+    <w:p>
+      <w:r>
+        <w:rPr>
+          <w:b/>
+          <w:color w:val="0E7A8C"/>
+        </w:rPr>
+        <w:t>1:15–1:45  Seal (Admin)</w:t>
+      </w:r>
+    </w:p>
+    <w:p>
+      <w:pPr>
+        <w:pStyle w:val="ListBullet"/>
+      </w:pPr>
+      <w:r>
+        <w:rPr>
+          <w:b/>
+          <w:color w:val="0E7A8C"/>
+        </w:rPr>
+        <w:t>SAY —</w:t>
+      </w:r>
+      <w:r>
+        <w:t xml:space="preserve">  As the controller I seal an exam in Dynamic mode — each candidate gets a unique paper assembled from an encrypted question bank. Release in thirty seconds. Seal it.</w:t>
+      </w:r>
+    </w:p>
+    <w:p>
+      <w:pPr>
+        <w:pStyle w:val="ListBullet"/>
+      </w:pPr>
+      <w:r>
+        <w:rPr>
+          <w:b/>
+          <w:color w:val="0E7A8C"/>
+        </w:rPr>
+        <w:t>SHOW —</w:t>
+      </w:r>
+      <w:r>
+        <w:t xml:space="preserve">  Admin → Seal a New Exam → Dynamic toggle → blueprint → +30s → Seal &amp; Distribute; point to the vault, the time gate, and the Dynamic Assembly strip.</w:t>
+      </w:r>
+    </w:p>
+    <w:p>
+      <w:r>
+        <w:rPr>
+          <w:b/>
+          <w:color w:val="0E7A8C"/>
+        </w:rPr>
+        <w:t>1:45–2:15  Unlock (Custodians)</w:t>
+      </w:r>
+    </w:p>
+    <w:p>
+      <w:pPr>
+        <w:pStyle w:val="ListBullet"/>
+      </w:pPr>
+      <w:r>
+        <w:rPr>
+          <w:b/>
+          <w:color w:val="0E7A8C"/>
+        </w:rPr>
+        <w:t>SAY —</w:t>
+      </w:r>
+      <w:r>
+        <w:t xml:space="preserve">  Each custodian submits one key share; the quorum fills two-of-three, three-of-three. But even with every share in, the vault stays sealed until the clock hits zero — the time gate — and then it opens.</w:t>
+      </w:r>
+    </w:p>
+    <w:p>
+      <w:pPr>
+        <w:pStyle w:val="ListBullet"/>
+      </w:pPr>
+      <w:r>
+        <w:rPr>
+          <w:b/>
+          <w:color w:val="0E7A8C"/>
+        </w:rPr>
+        <w:t>SHOW —</w:t>
+      </w:r>
+      <w:r>
+        <w:t xml:space="preserve">  Custodian → submit shares; back to Admin ops panel → vault animates UNLOCKED.</w:t>
+      </w:r>
+    </w:p>
+    <w:p>
+      <w:r>
+        <w:rPr>
+          <w:b/>
+          <w:color w:val="0E7A8C"/>
+        </w:rPr>
+        <w:t>2:15–2:45  Unique papers (Candidate)</w:t>
+      </w:r>
+    </w:p>
+    <w:p>
+      <w:pPr>
+        <w:pStyle w:val="ListBullet"/>
+      </w:pPr>
+      <w:r>
+        <w:rPr>
+          <w:b/>
+          <w:color w:val="0E7A8C"/>
+        </w:rPr>
+        <w:t>SAY —</w:t>
+      </w:r>
+      <w:r>
+        <w:t xml:space="preserve">  The candidate's own watermarked paper. Switch to a different candidate — the questions are different. Every copy is content-distinct and individually fingerprinted, so a leak exposes only one variant and points to its owner.</w:t>
+      </w:r>
+    </w:p>
+    <w:p>
+      <w:pPr>
+        <w:pStyle w:val="ListBullet"/>
+      </w:pPr>
+      <w:r>
+        <w:rPr>
+          <w:b/>
+          <w:color w:val="0E7A8C"/>
+        </w:rPr>
+        <w:t>SHOW —</w:t>
+      </w:r>
+      <w:r>
+        <w:t xml:space="preserve">  Candidate cand001 → paper + fingerprint; role-switch to cand002 → different questions.</w:t>
+      </w:r>
+    </w:p>
+    <w:p>
+      <w:r>
+        <w:rPr>
+          <w:b/>
+          <w:color w:val="0E7A8C"/>
+        </w:rPr>
+        <w:t>2:45–3:25  Catch the leak (Investigator)</w:t>
+      </w:r>
+    </w:p>
+    <w:p>
+      <w:pPr>
+        <w:pStyle w:val="ListBullet"/>
+      </w:pPr>
+      <w:r>
+        <w:rPr>
+          <w:b/>
+          <w:color w:val="0E7A8C"/>
+        </w:rPr>
+        <w:t>SAY —</w:t>
+      </w:r>
+      <w:r>
+        <w:t xml:space="preserve">  Suppose the paper turns up on a chat group. I paste the text into the Leak-Match Detector — it names the suspect, R-001. If I have a photo instead, Forensic Trace recovers the watermark even after JPEG re-compression and identifies the source at 100% confidence. Every detection becomes a case file with the candidate's full details, sealed in a hash chain — Verify Integrity: intact.</w:t>
+      </w:r>
+    </w:p>
+    <w:p>
+      <w:pPr>
+        <w:pStyle w:val="ListBullet"/>
+      </w:pPr>
+      <w:r>
+        <w:rPr>
+          <w:b/>
+          <w:color w:val="0E7A8C"/>
+        </w:rPr>
+        <w:t>SHOW —</w:t>
+      </w:r>
+      <w:r>
+        <w:t xml:space="preserve">  Investigator → Leak-Match (paste text) → suspect; Forensic Trace (upload image) → traced; Case Files → open case → full candidate card; Verify Integrity → chain intact.</w:t>
+      </w:r>
+    </w:p>
+    <w:p>
+      <w:r>
+        <w:rPr>
+          <w:b/>
+          <w:color w:val="0E7A8C"/>
+        </w:rPr>
+        <w:t>3:25–3:40  Close</w:t>
+      </w:r>
+    </w:p>
+    <w:p>
+      <w:pPr>
+        <w:pStyle w:val="ListBullet"/>
+      </w:pPr>
+      <w:r>
+        <w:rPr>
+          <w:b/>
+          <w:color w:val="0E7A8C"/>
+        </w:rPr>
+        <w:t>SAY —</w:t>
+      </w:r>
+      <w:r>
+        <w:t xml:space="preserve">  Trace makes early opening cryptographically impossible, every copy traceable, and every record tamper-proof — backed by 86 passing tests and crypto built from scratch. Leaks become impossible to hide, and impossible to deny.</w:t>
+      </w:r>
+    </w:p>
+    <w:p>
+      <w:pPr>
+        <w:pStyle w:val="ListBullet"/>
+      </w:pPr>
+      <w:r>
+        <w:rPr>
+          <w:b/>
+          <w:color w:val="0E7A8C"/>
+        </w:rPr>
+        <w:t>SHOW —</w:t>
+      </w:r>
+      <w:r>
+        <w:t xml:space="preserve">  Return to the dashboard header; optional end card with the three guarantees.</w:t>
+      </w:r>
+    </w:p>
     <w:p/>
     <w:p>
       <w:pPr>

</xml_diff>